<commit_message>
MB001 #444: atomic correction candidate
</commit_message>
<xml_diff>
--- a/tools/candidates/s1-oplata-za-raboty/10-obrashchenie-v-sud.docx
+++ b/tools/candidates/s1-oplata-za-raboty/10-obrashchenie-v-sud.docx
@@ -624,6 +624,63 @@
     </w:tbl>
     <w:p/>
     <w:p>
+      <w:r>
+        <w:rPr>
+          <w:b/>
+          <w:i w:val="0"/>
+        </w:rPr>
+        <w:t>Как заполнить перечень приложений к иску (раздел Б)</w:t>
+      </w:r>
+    </w:p>
+    <w:p>
+      <w:pPr>
+        <w:pStyle w:val="ListBullet"/>
+      </w:pPr>
+      <w:r>
+        <w:t>Перечень собирается из файла 04, лист «Реестр приложений»: в него переносится каждая строка, у которой в колонке «К иску» стоит «Да», — одна строка реестра, одна строка перечня, в порядке реестра. В графу «Документ» впишите наименование документа (колонка «Документ» реестра), его номер и дату (колонка «№ и дата»), в графу «Листов» — число листов (колонка «Листов»). В самом иске ссылки на файл 04 нет: в перечень вписываются сами документы.</w:t>
+      </w:r>
+    </w:p>
+    <w:p>
+      <w:pPr>
+        <w:pStyle w:val="ListBullet"/>
+      </w:pPr>
+      <w:r>
+        <w:t>В перечне должны быть: документ об уплате пошлины; доказательство направления иска ответчику; договор; акты; доказательства передачи; расчёт; претензия и доказательство её направления; выписки ЕГРЮЛ на истца и ответчика; доверенность представителя (если подписывает представитель).</w:t>
+      </w:r>
+    </w:p>
+    <w:p>
+      <w:pPr>
+        <w:pStyle w:val="ListBullet"/>
+      </w:pPr>
+      <w:r>
+        <w:t>Входящие документы заказчика — гарантийное письмо, протокол переговоров или соглашение, подписанный Заказчиком акт сверки, возражения Заказчика — попадают в перечень так же: если у их строки в реестре в колонке «К иску» стоит «Да».</w:t>
+      </w:r>
+    </w:p>
+    <w:p>
+      <w:pPr>
+        <w:pStyle w:val="ListBullet"/>
+      </w:pPr>
+      <w:r>
+        <w:t>Доверенность представителя прикладывается, только если иск подписывает представитель. Подписывает руководитель — в реестре у строки «Доверенность представителя» в колонке «К иску» поставьте «Нет» и в перечень её не включайте.</w:t>
+      </w:r>
+    </w:p>
+    <w:p>
+      <w:pPr>
+        <w:pStyle w:val="ListBullet"/>
+      </w:pPr>
+      <w:r>
+        <w:t>Лишние пустые строки перечня удалите; не хватает строк — добавьте. Строку документа из перечня выше не удаляйте и не оставляйте пустой: нет документа — иск не готов (пункт 11 проверочного листа: «Нужно к иску, но нет» = 0).</w:t>
+      </w:r>
+    </w:p>
+    <w:p>
+      <w:pPr>
+        <w:pStyle w:val="ListBullet"/>
+      </w:pPr>
+      <w:r>
+        <w:t>Перед подписанием сверьте: строк в перечне столько же, сколько в реестре строк с «Да» в колонке «К иску», и число листов в каждой строке совпадает с реестром.</w:t>
+      </w:r>
+    </w:p>
+    <w:p>
       <w:pPr>
         <w:pStyle w:val="Heading1"/>
       </w:pPr>
@@ -760,9 +817,500 @@
           <w:b w:val="0"/>
           <w:i w:val="0"/>
         </w:rPr>
-        <w:t>Приложения: по реестру приложений (файл 04), отметка «К иску»: документ об уплате пошлины; доказательство направления иска ответчику; договор; акты; доказательства передачи; расчёт; претензия и доказательство её направления; выписки ЕГРЮЛ на истца и ответчика; доверенность представителя (если подписывает представитель).</w:t>
+        <w:t>Приложения:</w:t>
       </w:r>
     </w:p>
+    <w:tbl>
+      <w:tblPr>
+        <w:tblStyle w:val="TableGrid"/>
+        <w:tblW w:type="auto" w:w="0"/>
+        <w:jc w:val="center"/>
+        <w:tblLayout w:type="fixed"/>
+        <w:tblLook w:firstColumn="1" w:firstRow="1" w:lastColumn="0" w:lastRow="0" w:noHBand="0" w:noVBand="1" w:val="04A0"/>
+      </w:tblPr>
+      <w:tblGrid>
+        <w:gridCol w:w="567"/>
+        <w:gridCol w:w="6803"/>
+        <w:gridCol w:w="1247"/>
+      </w:tblGrid>
+      <w:tr>
+        <w:tc>
+          <w:tcPr>
+            <w:tcW w:type="dxa" w:w="567"/>
+          </w:tcPr>
+          <w:p>
+            <w:r/>
+            <w:r>
+              <w:rPr>
+                <w:b/>
+              </w:rPr>
+              <w:t>№</w:t>
+            </w:r>
+          </w:p>
+        </w:tc>
+        <w:tc>
+          <w:tcPr>
+            <w:tcW w:type="dxa" w:w="6803"/>
+          </w:tcPr>
+          <w:p>
+            <w:r/>
+            <w:r>
+              <w:rPr>
+                <w:b/>
+              </w:rPr>
+              <w:t>Документ (наименование, № и дата)</w:t>
+            </w:r>
+          </w:p>
+        </w:tc>
+        <w:tc>
+          <w:tcPr>
+            <w:tcW w:type="dxa" w:w="1247"/>
+          </w:tcPr>
+          <w:p>
+            <w:r/>
+            <w:r>
+              <w:rPr>
+                <w:b/>
+              </w:rPr>
+              <w:t>Листов</w:t>
+            </w:r>
+          </w:p>
+        </w:tc>
+      </w:tr>
+      <w:tr>
+        <w:tc>
+          <w:tcPr>
+            <w:tcW w:type="dxa" w:w="567"/>
+          </w:tcPr>
+          <w:p>
+            <w:r>
+              <w:t>1</w:t>
+            </w:r>
+          </w:p>
+        </w:tc>
+        <w:tc>
+          <w:tcPr>
+            <w:tcW w:type="dxa" w:w="6803"/>
+          </w:tcPr>
+          <w:p/>
+        </w:tc>
+        <w:tc>
+          <w:tcPr>
+            <w:tcW w:type="dxa" w:w="1247"/>
+          </w:tcPr>
+          <w:p/>
+        </w:tc>
+      </w:tr>
+      <w:tr>
+        <w:tc>
+          <w:tcPr>
+            <w:tcW w:type="dxa" w:w="567"/>
+          </w:tcPr>
+          <w:p>
+            <w:r>
+              <w:t>2</w:t>
+            </w:r>
+          </w:p>
+        </w:tc>
+        <w:tc>
+          <w:tcPr>
+            <w:tcW w:type="dxa" w:w="6803"/>
+          </w:tcPr>
+          <w:p/>
+        </w:tc>
+        <w:tc>
+          <w:tcPr>
+            <w:tcW w:type="dxa" w:w="1247"/>
+          </w:tcPr>
+          <w:p/>
+        </w:tc>
+      </w:tr>
+      <w:tr>
+        <w:tc>
+          <w:tcPr>
+            <w:tcW w:type="dxa" w:w="567"/>
+          </w:tcPr>
+          <w:p>
+            <w:r>
+              <w:t>3</w:t>
+            </w:r>
+          </w:p>
+        </w:tc>
+        <w:tc>
+          <w:tcPr>
+            <w:tcW w:type="dxa" w:w="6803"/>
+          </w:tcPr>
+          <w:p/>
+        </w:tc>
+        <w:tc>
+          <w:tcPr>
+            <w:tcW w:type="dxa" w:w="1247"/>
+          </w:tcPr>
+          <w:p/>
+        </w:tc>
+      </w:tr>
+      <w:tr>
+        <w:tc>
+          <w:tcPr>
+            <w:tcW w:type="dxa" w:w="567"/>
+          </w:tcPr>
+          <w:p>
+            <w:r>
+              <w:t>4</w:t>
+            </w:r>
+          </w:p>
+        </w:tc>
+        <w:tc>
+          <w:tcPr>
+            <w:tcW w:type="dxa" w:w="6803"/>
+          </w:tcPr>
+          <w:p/>
+        </w:tc>
+        <w:tc>
+          <w:tcPr>
+            <w:tcW w:type="dxa" w:w="1247"/>
+          </w:tcPr>
+          <w:p/>
+        </w:tc>
+      </w:tr>
+      <w:tr>
+        <w:tc>
+          <w:tcPr>
+            <w:tcW w:type="dxa" w:w="567"/>
+          </w:tcPr>
+          <w:p>
+            <w:r>
+              <w:t>5</w:t>
+            </w:r>
+          </w:p>
+        </w:tc>
+        <w:tc>
+          <w:tcPr>
+            <w:tcW w:type="dxa" w:w="6803"/>
+          </w:tcPr>
+          <w:p/>
+        </w:tc>
+        <w:tc>
+          <w:tcPr>
+            <w:tcW w:type="dxa" w:w="1247"/>
+          </w:tcPr>
+          <w:p/>
+        </w:tc>
+      </w:tr>
+      <w:tr>
+        <w:tc>
+          <w:tcPr>
+            <w:tcW w:type="dxa" w:w="567"/>
+          </w:tcPr>
+          <w:p>
+            <w:r>
+              <w:t>6</w:t>
+            </w:r>
+          </w:p>
+        </w:tc>
+        <w:tc>
+          <w:tcPr>
+            <w:tcW w:type="dxa" w:w="6803"/>
+          </w:tcPr>
+          <w:p/>
+        </w:tc>
+        <w:tc>
+          <w:tcPr>
+            <w:tcW w:type="dxa" w:w="1247"/>
+          </w:tcPr>
+          <w:p/>
+        </w:tc>
+      </w:tr>
+      <w:tr>
+        <w:tc>
+          <w:tcPr>
+            <w:tcW w:type="dxa" w:w="567"/>
+          </w:tcPr>
+          <w:p>
+            <w:r>
+              <w:t>7</w:t>
+            </w:r>
+          </w:p>
+        </w:tc>
+        <w:tc>
+          <w:tcPr>
+            <w:tcW w:type="dxa" w:w="6803"/>
+          </w:tcPr>
+          <w:p/>
+        </w:tc>
+        <w:tc>
+          <w:tcPr>
+            <w:tcW w:type="dxa" w:w="1247"/>
+          </w:tcPr>
+          <w:p/>
+        </w:tc>
+      </w:tr>
+      <w:tr>
+        <w:tc>
+          <w:tcPr>
+            <w:tcW w:type="dxa" w:w="567"/>
+          </w:tcPr>
+          <w:p>
+            <w:r>
+              <w:t>8</w:t>
+            </w:r>
+          </w:p>
+        </w:tc>
+        <w:tc>
+          <w:tcPr>
+            <w:tcW w:type="dxa" w:w="6803"/>
+          </w:tcPr>
+          <w:p/>
+        </w:tc>
+        <w:tc>
+          <w:tcPr>
+            <w:tcW w:type="dxa" w:w="1247"/>
+          </w:tcPr>
+          <w:p/>
+        </w:tc>
+      </w:tr>
+      <w:tr>
+        <w:tc>
+          <w:tcPr>
+            <w:tcW w:type="dxa" w:w="567"/>
+          </w:tcPr>
+          <w:p>
+            <w:r>
+              <w:t>9</w:t>
+            </w:r>
+          </w:p>
+        </w:tc>
+        <w:tc>
+          <w:tcPr>
+            <w:tcW w:type="dxa" w:w="6803"/>
+          </w:tcPr>
+          <w:p/>
+        </w:tc>
+        <w:tc>
+          <w:tcPr>
+            <w:tcW w:type="dxa" w:w="1247"/>
+          </w:tcPr>
+          <w:p/>
+        </w:tc>
+      </w:tr>
+      <w:tr>
+        <w:tc>
+          <w:tcPr>
+            <w:tcW w:type="dxa" w:w="567"/>
+          </w:tcPr>
+          <w:p>
+            <w:r>
+              <w:t>10</w:t>
+            </w:r>
+          </w:p>
+        </w:tc>
+        <w:tc>
+          <w:tcPr>
+            <w:tcW w:type="dxa" w:w="6803"/>
+          </w:tcPr>
+          <w:p/>
+        </w:tc>
+        <w:tc>
+          <w:tcPr>
+            <w:tcW w:type="dxa" w:w="1247"/>
+          </w:tcPr>
+          <w:p/>
+        </w:tc>
+      </w:tr>
+      <w:tr>
+        <w:tc>
+          <w:tcPr>
+            <w:tcW w:type="dxa" w:w="567"/>
+          </w:tcPr>
+          <w:p>
+            <w:r>
+              <w:t>11</w:t>
+            </w:r>
+          </w:p>
+        </w:tc>
+        <w:tc>
+          <w:tcPr>
+            <w:tcW w:type="dxa" w:w="6803"/>
+          </w:tcPr>
+          <w:p/>
+        </w:tc>
+        <w:tc>
+          <w:tcPr>
+            <w:tcW w:type="dxa" w:w="1247"/>
+          </w:tcPr>
+          <w:p/>
+        </w:tc>
+      </w:tr>
+      <w:tr>
+        <w:tc>
+          <w:tcPr>
+            <w:tcW w:type="dxa" w:w="567"/>
+          </w:tcPr>
+          <w:p>
+            <w:r>
+              <w:t>12</w:t>
+            </w:r>
+          </w:p>
+        </w:tc>
+        <w:tc>
+          <w:tcPr>
+            <w:tcW w:type="dxa" w:w="6803"/>
+          </w:tcPr>
+          <w:p/>
+        </w:tc>
+        <w:tc>
+          <w:tcPr>
+            <w:tcW w:type="dxa" w:w="1247"/>
+          </w:tcPr>
+          <w:p/>
+        </w:tc>
+      </w:tr>
+      <w:tr>
+        <w:tc>
+          <w:tcPr>
+            <w:tcW w:type="dxa" w:w="567"/>
+          </w:tcPr>
+          <w:p>
+            <w:r>
+              <w:t>13</w:t>
+            </w:r>
+          </w:p>
+        </w:tc>
+        <w:tc>
+          <w:tcPr>
+            <w:tcW w:type="dxa" w:w="6803"/>
+          </w:tcPr>
+          <w:p/>
+        </w:tc>
+        <w:tc>
+          <w:tcPr>
+            <w:tcW w:type="dxa" w:w="1247"/>
+          </w:tcPr>
+          <w:p/>
+        </w:tc>
+      </w:tr>
+      <w:tr>
+        <w:tc>
+          <w:tcPr>
+            <w:tcW w:type="dxa" w:w="567"/>
+          </w:tcPr>
+          <w:p>
+            <w:r>
+              <w:t>14</w:t>
+            </w:r>
+          </w:p>
+        </w:tc>
+        <w:tc>
+          <w:tcPr>
+            <w:tcW w:type="dxa" w:w="6803"/>
+          </w:tcPr>
+          <w:p/>
+        </w:tc>
+        <w:tc>
+          <w:tcPr>
+            <w:tcW w:type="dxa" w:w="1247"/>
+          </w:tcPr>
+          <w:p/>
+        </w:tc>
+      </w:tr>
+      <w:tr>
+        <w:tc>
+          <w:tcPr>
+            <w:tcW w:type="dxa" w:w="567"/>
+          </w:tcPr>
+          <w:p>
+            <w:r>
+              <w:t>15</w:t>
+            </w:r>
+          </w:p>
+        </w:tc>
+        <w:tc>
+          <w:tcPr>
+            <w:tcW w:type="dxa" w:w="6803"/>
+          </w:tcPr>
+          <w:p/>
+        </w:tc>
+        <w:tc>
+          <w:tcPr>
+            <w:tcW w:type="dxa" w:w="1247"/>
+          </w:tcPr>
+          <w:p/>
+        </w:tc>
+      </w:tr>
+      <w:tr>
+        <w:tc>
+          <w:tcPr>
+            <w:tcW w:type="dxa" w:w="567"/>
+          </w:tcPr>
+          <w:p>
+            <w:r>
+              <w:t>16</w:t>
+            </w:r>
+          </w:p>
+        </w:tc>
+        <w:tc>
+          <w:tcPr>
+            <w:tcW w:type="dxa" w:w="6803"/>
+          </w:tcPr>
+          <w:p/>
+        </w:tc>
+        <w:tc>
+          <w:tcPr>
+            <w:tcW w:type="dxa" w:w="1247"/>
+          </w:tcPr>
+          <w:p/>
+        </w:tc>
+      </w:tr>
+      <w:tr>
+        <w:tc>
+          <w:tcPr>
+            <w:tcW w:type="dxa" w:w="567"/>
+          </w:tcPr>
+          <w:p>
+            <w:r>
+              <w:t>17</w:t>
+            </w:r>
+          </w:p>
+        </w:tc>
+        <w:tc>
+          <w:tcPr>
+            <w:tcW w:type="dxa" w:w="6803"/>
+          </w:tcPr>
+          <w:p/>
+        </w:tc>
+        <w:tc>
+          <w:tcPr>
+            <w:tcW w:type="dxa" w:w="1247"/>
+          </w:tcPr>
+          <w:p/>
+        </w:tc>
+      </w:tr>
+      <w:tr>
+        <w:tc>
+          <w:tcPr>
+            <w:tcW w:type="dxa" w:w="567"/>
+          </w:tcPr>
+          <w:p>
+            <w:r>
+              <w:t>18</w:t>
+            </w:r>
+          </w:p>
+        </w:tc>
+        <w:tc>
+          <w:tcPr>
+            <w:tcW w:type="dxa" w:w="6803"/>
+          </w:tcPr>
+          <w:p/>
+        </w:tc>
+        <w:tc>
+          <w:tcPr>
+            <w:tcW w:type="dxa" w:w="1247"/>
+          </w:tcPr>
+          <w:p/>
+        </w:tc>
+      </w:tr>
+    </w:tbl>
+    <w:p/>
     <w:p>
       <w:r>
         <w:rPr>

</xml_diff>

<commit_message>
Keep S1 court readiness checklist rows together and repeat header
</commit_message>
<xml_diff>
--- a/tools/candidates/s1-oplata-za-raboty/10-obrashchenie-v-sud.docx
+++ b/tools/candidates/s1-oplata-za-raboty/10-obrashchenie-v-sud.docx
@@ -60,11 +60,18 @@
         <w:gridCol w:w="567"/>
       </w:tblGrid>
       <w:tr>
+        <w:trPr>
+          <w:cantSplit/>
+          <w:tblHeader/>
+        </w:trPr>
         <w:tc>
           <w:tcPr>
             <w:tcW w:type="dxa" w:w="567"/>
           </w:tcPr>
           <w:p>
+            <w:pPr>
+              <w:keepNext/>
+            </w:pPr>
             <w:r/>
             <w:r>
               <w:rPr>
@@ -79,6 +86,9 @@
             <w:tcW w:type="dxa" w:w="4762"/>
           </w:tcPr>
           <w:p>
+            <w:pPr>
+              <w:keepNext/>
+            </w:pPr>
             <w:r/>
             <w:r>
               <w:rPr>
@@ -93,6 +103,9 @@
             <w:tcW w:type="dxa" w:w="2721"/>
           </w:tcPr>
           <w:p>
+            <w:pPr>
+              <w:keepNext/>
+            </w:pPr>
             <w:r/>
             <w:r>
               <w:rPr>
@@ -107,6 +120,9 @@
             <w:tcW w:type="dxa" w:w="567"/>
           </w:tcPr>
           <w:p>
+            <w:pPr>
+              <w:keepNext/>
+            </w:pPr>
             <w:r/>
             <w:r>
               <w:rPr>
@@ -118,6 +134,9 @@
         </w:tc>
       </w:tr>
       <w:tr>
+        <w:trPr>
+          <w:cantSplit/>
+        </w:trPr>
         <w:tc>
           <w:tcPr>
             <w:tcW w:type="dxa" w:w="567"/>
@@ -160,6 +179,9 @@
         </w:tc>
       </w:tr>
       <w:tr>
+        <w:trPr>
+          <w:cantSplit/>
+        </w:trPr>
         <w:tc>
           <w:tcPr>
             <w:tcW w:type="dxa" w:w="567"/>
@@ -202,6 +224,9 @@
         </w:tc>
       </w:tr>
       <w:tr>
+        <w:trPr>
+          <w:cantSplit/>
+        </w:trPr>
         <w:tc>
           <w:tcPr>
             <w:tcW w:type="dxa" w:w="567"/>
@@ -244,6 +269,9 @@
         </w:tc>
       </w:tr>
       <w:tr>
+        <w:trPr>
+          <w:cantSplit/>
+        </w:trPr>
         <w:tc>
           <w:tcPr>
             <w:tcW w:type="dxa" w:w="567"/>
@@ -286,6 +314,9 @@
         </w:tc>
       </w:tr>
       <w:tr>
+        <w:trPr>
+          <w:cantSplit/>
+        </w:trPr>
         <w:tc>
           <w:tcPr>
             <w:tcW w:type="dxa" w:w="567"/>
@@ -328,6 +359,9 @@
         </w:tc>
       </w:tr>
       <w:tr>
+        <w:trPr>
+          <w:cantSplit/>
+        </w:trPr>
         <w:tc>
           <w:tcPr>
             <w:tcW w:type="dxa" w:w="567"/>
@@ -370,6 +404,9 @@
         </w:tc>
       </w:tr>
       <w:tr>
+        <w:trPr>
+          <w:cantSplit/>
+        </w:trPr>
         <w:tc>
           <w:tcPr>
             <w:tcW w:type="dxa" w:w="567"/>
@@ -412,6 +449,9 @@
         </w:tc>
       </w:tr>
       <w:tr>
+        <w:trPr>
+          <w:cantSplit/>
+        </w:trPr>
         <w:tc>
           <w:tcPr>
             <w:tcW w:type="dxa" w:w="567"/>
@@ -454,6 +494,9 @@
         </w:tc>
       </w:tr>
       <w:tr>
+        <w:trPr>
+          <w:cantSplit/>
+        </w:trPr>
         <w:tc>
           <w:tcPr>
             <w:tcW w:type="dxa" w:w="567"/>
@@ -496,6 +539,9 @@
         </w:tc>
       </w:tr>
       <w:tr>
+        <w:trPr>
+          <w:cantSplit/>
+        </w:trPr>
         <w:tc>
           <w:tcPr>
             <w:tcW w:type="dxa" w:w="567"/>
@@ -538,6 +584,9 @@
         </w:tc>
       </w:tr>
       <w:tr>
+        <w:trPr>
+          <w:cantSplit/>
+        </w:trPr>
         <w:tc>
           <w:tcPr>
             <w:tcW w:type="dxa" w:w="567"/>
@@ -580,6 +629,9 @@
         </w:tc>
       </w:tr>
       <w:tr>
+        <w:trPr>
+          <w:cantSplit/>
+        </w:trPr>
         <w:tc>
           <w:tcPr>
             <w:tcW w:type="dxa" w:w="567"/>

</xml_diff>